<commit_message>
Apply Jalour answers: funding-gap source, separate-account position, delivery-price comparison, NDA-gated sponsor material; rebuild all packs
Co-Authored-By: Claude Sonnet 5.5 <noreply@anthropic.com>
Claude-Session: https://claude.ai/code/session_01Tace5U23AKexiDyfCZxMPM
</commit_message>
<xml_diff>
--- a/output/GS_050M/DD_Memo.docx
+++ b/output/GS_050M/DD_Memo.docx
@@ -85,7 +85,7 @@
           <w:b w:val="0"/>
           <w:i w:val="0"/>
         </w:rPr>
-        <w:t>This memorandum helps the investor and its advisers plan and carry out due diligence. It lists the documents Jalour will provide, the legal and regulatory structure, the evidence behind the main assumptions, the opinions and security documents required, a candid list of red flags, and the open items. It describes status as at October 2026. Items in square brackets are pending from Jalour. It is not legal advice.</w:t>
+        <w:t>This memorandum helps the investor and its advisers plan and carry out due diligence. It lists the documents Jalour will provide, the legal and regulatory structure, the evidence behind the main assumptions, the opinions and security documents required, a candid list of red flags, and the open items. It describes status as at October 2026. Items marked [After NDA] are provided after the investor signs a non-disclosure agreement; items marked [Pending] are being prepared. It is not legal advice.</w:t>
       </w:r>
     </w:p>
     <w:p>
@@ -481,7 +481,7 @@
               <w:rPr>
                 <w:sz w:val="19"/>
               </w:rPr>
-              <w:t>[Registration details and constitutional documents pending]</w:t>
+              <w:t>[After NDA]</w:t>
             </w:r>
           </w:p>
         </w:tc>
@@ -541,7 +541,7 @@
               <w:rPr>
                 <w:sz w:val="19"/>
               </w:rPr>
-              <w:t>[Registration, ownership and board pending]</w:t>
+              <w:t>[After NDA]</w:t>
             </w:r>
           </w:p>
         </w:tc>
@@ -762,7 +762,7 @@
           <w:b w:val="0"/>
           <w:i w:val="0"/>
         </w:rPr>
-        <w:t>No funds are ring-fenced or held in restricted accounts under the proposed structure. Counsel to confirm whether any separate project account is required by law for these plots (section 6).</w:t>
+        <w:t>No funds are ring-fenced or held in restricted accounts under the proposed structure. Jalour's position is that the rule requiring a separate project account for developers on state-allocated land does not apply to these plots; the basis is in the data room.</w:t>
       </w:r>
     </w:p>
     <w:p>
@@ -1481,7 +1481,7 @@
               <w:rPr>
                 <w:sz w:val="19"/>
               </w:rPr>
-              <w:t>[Not yet sought]</w:t>
+              <w:t>[Status after NDA]</w:t>
             </w:r>
           </w:p>
         </w:tc>
@@ -1540,7 +1540,7 @@
               <w:rPr>
                 <w:sz w:val="19"/>
               </w:rPr>
-              <w:t>[Not yet sought]</w:t>
+              <w:t>[Status after NDA]</w:t>
             </w:r>
           </w:p>
         </w:tc>
@@ -1596,7 +1596,7 @@
               <w:rPr>
                 <w:sz w:val="19"/>
               </w:rPr>
-              <w:t>[Not yet sought]</w:t>
+              <w:t>[Status after NDA]</w:t>
             </w:r>
           </w:p>
         </w:tc>
@@ -1655,7 +1655,7 @@
               <w:rPr>
                 <w:sz w:val="19"/>
               </w:rPr>
-              <w:t>[Not yet sought]</w:t>
+              <w:t>[Status after NDA]</w:t>
             </w:r>
           </w:p>
         </w:tc>
@@ -1880,7 +1880,7 @@
               <w:rPr>
                 <w:sz w:val="19"/>
               </w:rPr>
-              <w:t>[Pending from Jalour]</w:t>
+              <w:t>[After NDA]</w:t>
             </w:r>
           </w:p>
         </w:tc>
@@ -1938,7 +1938,7 @@
               <w:rPr>
                 <w:sz w:val="19"/>
               </w:rPr>
-              <w:t>[Pending]</w:t>
+              <w:t>[After NDA]</w:t>
             </w:r>
           </w:p>
         </w:tc>
@@ -1995,7 +1995,7 @@
               <w:rPr>
                 <w:sz w:val="19"/>
               </w:rPr>
-              <w:t>[Pending]</w:t>
+              <w:t>[After NDA]</w:t>
             </w:r>
           </w:p>
         </w:tc>
@@ -2053,7 +2053,7 @@
               <w:rPr>
                 <w:sz w:val="19"/>
               </w:rPr>
-              <w:t>[Pending]</w:t>
+              <w:t>[After NDA]</w:t>
             </w:r>
           </w:p>
         </w:tc>
@@ -2110,7 +2110,7 @@
               <w:rPr>
                 <w:sz w:val="19"/>
               </w:rPr>
-              <w:t>[Pending]</w:t>
+              <w:t>[After NDA]</w:t>
             </w:r>
           </w:p>
         </w:tc>
@@ -2168,7 +2168,7 @@
               <w:rPr>
                 <w:sz w:val="19"/>
               </w:rPr>
-              <w:t>[Pending]</w:t>
+              <w:t>[After NDA]</w:t>
             </w:r>
           </w:p>
         </w:tc>
@@ -2203,7 +2203,7 @@
           <w:b w:val="0"/>
           <w:i w:val="0"/>
         </w:rPr>
-        <w:t>Prime Minister Decree 2184 of 2022 reportedly bars developers on state-allocated land from announcing sales before approval of the general and detailed plans (Invest-Gate; Mondaq). Counsel to confirm applicability to this plot.</w:t>
+        <w:t>Prime Minister Decree 2184 of 2022 reportedly bars developers on state-allocated land from announcing sales before approval of the general and detailed plans (Invest-Gate; Mondaq). Jalour's position is that it does not apply to these plots; the basis is provided in the data room after the investor signs a non-disclosure agreement.</w:t>
       </w:r>
     </w:p>
     <w:p>
@@ -3052,7 +3052,7 @@
                 <w:color w:val="FFFFFF"/>
                 <w:sz w:val="18"/>
               </w:rPr>
-              <w:t>Plan: final</w:t>
+              <w:t>Plan: delivery list</w:t>
             </w:r>
           </w:p>
         </w:tc>
@@ -3308,7 +3308,7 @@
           <w:b w:val="0"/>
           <w:i w:val="0"/>
         </w:rPr>
-        <w:t>The plan raises list prices by 33% (retail) and 48% (offices) from the first to the last sales tranche. New Cairo secondary prices rose 3.1% y/y in Q1 2026 (JLL via Enterprise); broker estimates for 2026 are 10% to 16% a year (a blog estimate).</w:t>
+        <w:t>The plan raises list prices by 33% (retail) and 48% (offices) from the first to the last sales tranche. New Cairo secondary prices rose 3.1% y/y in Q1 2026 (JLL via Enterprise); broker estimates for 2026 are 10% to 16% a year (a blog estimate). Against today's office asking prices (mid-point EGP 113,000) the delivery list is +77%, about 15% a year to handover.</w:t>
       </w:r>
     </w:p>
     <w:p>
@@ -3919,7 +3919,7 @@
           <w:b w:val="0"/>
           <w:i w:val="0"/>
         </w:rPr>
-        <w:t>Whether the developer must hold a separate project bank account for these plots (reported for developers on state-allocated land under Decree 2184 of 2022). The proposed structure does not ring-fence funds; counsel to confirm that it complies.</w:t>
+        <w:t>The basis for Jalour's position that the separate project-account rule for developers on state-allocated land (Decree 2184 of 2022) does not apply to these plots. The proposed structure does not ring-fence funds.</w:t>
       </w:r>
     </w:p>
     <w:p>
@@ -6767,7 +6767,7 @@
           <w:b w:val="0"/>
           <w:i w:val="0"/>
         </w:rPr>
-        <w:t xml:space="preserve"> and the permit, title and consent items in sections 2 and 3 are pending.</w:t>
+        <w:t xml:space="preserve"> and the permit, title and consent documents in sections 2 and 3 are provided after the investor signs a non-disclosure agreement.</w:t>
       </w:r>
     </w:p>
     <w:p>
@@ -6867,7 +6867,7 @@
           <w:b w:val="0"/>
           <w:i w:val="0"/>
         </w:rPr>
-        <w:t xml:space="preserve"> (track record, audited accounts) and the </w:t>
+        <w:t xml:space="preserve"> (track record, audited accounts) is provided only after the investor signs a non-disclosure agreement, and the </w:t>
       </w:r>
       <w:r>
         <w:rPr>
@@ -6881,7 +6881,7 @@
           <w:b w:val="0"/>
           <w:i w:val="0"/>
         </w:rPr>
-        <w:t xml:space="preserve"> are pending.</w:t>
+        <w:t xml:space="preserve"> is still open.</w:t>
       </w:r>
     </w:p>
     <w:p>
@@ -6958,7 +6958,7 @@
           <w:b w:val="0"/>
           <w:i w:val="0"/>
         </w:rPr>
-        <w:t xml:space="preserve"> Jalour has said it will fund project funding gaps from sponsor equity or other capital sources. The form and cap are to be documented; see red flag 7.</w:t>
+        <w:t xml:space="preserve"> Jalour has said it will cover project funding gaps from its cash reserves and from cash generated by other projects it is constructing. The form and cap are to be documented; see red flag 7.</w:t>
       </w:r>
     </w:p>
     <w:p>
@@ -7197,7 +7197,7 @@
               <w:rPr>
                 <w:sz w:val="19"/>
               </w:rPr>
-              <w:t>[Pending]</w:t>
+              <w:t>[After NDA]</w:t>
             </w:r>
           </w:p>
         </w:tc>
@@ -7274,7 +7274,7 @@
               <w:rPr>
                 <w:sz w:val="19"/>
               </w:rPr>
-              <w:t>[Pending]</w:t>
+              <w:t>[After NDA]</w:t>
             </w:r>
           </w:p>
         </w:tc>
@@ -7347,7 +7347,7 @@
               <w:rPr>
                 <w:sz w:val="19"/>
               </w:rPr>
-              <w:t>[Pending]</w:t>
+              <w:t>[After NDA]</w:t>
             </w:r>
           </w:p>
         </w:tc>
@@ -7424,7 +7424,7 @@
               <w:rPr>
                 <w:sz w:val="19"/>
               </w:rPr>
-              <w:t>[Pending]</w:t>
+              <w:t>[After NDA]</w:t>
             </w:r>
           </w:p>
         </w:tc>
@@ -7497,7 +7497,7 @@
               <w:rPr>
                 <w:sz w:val="19"/>
               </w:rPr>
-              <w:t>[Pending]</w:t>
+              <w:t>[After NDA]</w:t>
             </w:r>
           </w:p>
         </w:tc>
@@ -7647,7 +7647,7 @@
               <w:rPr>
                 <w:sz w:val="19"/>
               </w:rPr>
-              <w:t>[Pending]</w:t>
+              <w:t>[After NDA]</w:t>
             </w:r>
           </w:p>
         </w:tc>
@@ -7724,7 +7724,7 @@
               <w:rPr>
                 <w:sz w:val="19"/>
               </w:rPr>
-              <w:t>[Pending]</w:t>
+              <w:t>[After NDA]</w:t>
             </w:r>
           </w:p>
         </w:tc>

</xml_diff>

<commit_message>
Combined 125M investor pack (62.5M in each project), NDA template in every pack, confidentiality banners, QA
Co-Authored-By: Claude Sonnet 5.5 <noreply@anthropic.com>
Claude-Session: https://claude.ai/code/session_01Tace5U23AKexiDyfCZxMPM
</commit_message>
<xml_diff>
--- a/output/GS_050M/DD_Memo.docx
+++ b/output/GS_050M/DD_Memo.docx
@@ -60,6 +60,20 @@
       </w:r>
     </w:p>
     <w:p>
+      <w:pPr>
+        <w:spacing w:after="160"/>
+      </w:pPr>
+      <w:r>
+        <w:rPr>
+          <w:b/>
+          <w:i w:val="0"/>
+          <w:color w:val="B8893B"/>
+          <w:sz w:val="19"/>
+        </w:rPr>
+        <w:t>ALL INFORMATION IN THIS DOCUMENT IS CONFIDENTIAL AND SUBJECT TO THE NON-DISCLOSURE AGREEMENT.</w:t>
+      </w:r>
+    </w:p>
+    <w:p>
       <w:r>
         <w:rPr>
           <w:b w:val="0"/>
@@ -78,6 +92,50 @@
       <w:r>
         <w:t>Purpose and status</w:t>
       </w:r>
+    </w:p>
+    <w:tbl>
+      <w:tblPr>
+        <w:tblW w:type="auto" w:w="0"/>
+        <w:jc w:val="center"/>
+        <w:tblLayout w:type="fixed"/>
+        <w:tblCellMar>
+          <w:top w:w="100" w:type="dxa"/>
+          <w:left w:w="160" w:type="dxa"/>
+          <w:bottom w:w="100" w:type="dxa"/>
+          <w:right w:w="160" w:type="dxa"/>
+        </w:tblCellMar>
+        <w:tblLook w:firstColumn="1" w:firstRow="1" w:lastColumn="0" w:lastRow="0" w:noHBand="0" w:noVBand="1" w:val="04A0"/>
+      </w:tblPr>
+      <w:tblGrid>
+        <w:gridCol w:w="9298"/>
+      </w:tblGrid>
+      <w:tr>
+        <w:tc>
+          <w:tcPr>
+            <w:tcW w:type="dxa" w:w="9298"/>
+            <w:shd w:val="clear" w:color="auto" w:fill="FBF3E4"/>
+          </w:tcPr>
+          <w:p>
+            <w:pPr>
+              <w:spacing w:after="0"/>
+            </w:pPr>
+            <w:r/>
+            <w:r>
+              <w:rPr>
+                <w:b/>
+                <w:i w:val="0"/>
+                <w:sz w:val="20"/>
+              </w:rPr>
+              <w:t>ALL INFORMATION IN THIS DOCUMENT, IN THE OTHER DOCUMENTS OF THIS PACK AND IN THE DATA ROOM IS CONFIDENTIAL. It is provided only under the non-disclosure agreement between the recipient and Jalour, and must not be disclosed, copied, forwarded or used for any other purpose.</w:t>
+            </w:r>
+          </w:p>
+        </w:tc>
+      </w:tr>
+    </w:tbl>
+    <w:p>
+      <w:pPr>
+        <w:spacing w:after="80"/>
+      </w:pPr>
     </w:p>
     <w:p>
       <w:r>

</xml_diff>